<commit_message>
Final Salt Liot Review Done
</commit_message>
<xml_diff>
--- a/Thesis_Chapters/Chapter_1/Himalayan_Salt_Literature_Review_Draft.docx
+++ b/Thesis_Chapters/Chapter_1/Himalayan_Salt_Literature_Review_Draft.docx
@@ -460,7 +460,7 @@
       </w:pPr>
       <w:r>
         <w:rPr/>
-        <w:t>The project’s earlier manuscript proposes treating salt circulation as an infrastructure of governance (Bharti, n.d., pp. 1–2). Here that proposition becomes a question about which actors could organise labour, authorise movement, and enforce claims over extraction and exchange; it is not independent evidence that those powers operated uniformly. This thesis therefore asks how salt connected selected commodities, communities, places, and authorities within a specified Western Himalayan source corpus, and how those connections differed across sources and settings. It brings source-attributed relationships into a common representation and interprets them through close reading. Salt’s role as a connective backbone remains a hypothesis: frequent mentions, shared routes, or graph centrality do not independently establish economic dependence or region-wide dominance. Historical distinctions between periods, jurisdictions, and kinds of relationship must remain visible in the analysis. The following chapter examines the documentary materials through which these relationships can be reconstructed, including the limits imposed by administrative classification, selective observation, and uneven survival of evidence.</w:t>
+        <w:t>Examining salt circulation as an infrastructure of governance raises questions about which actors could organise labour, authorise movement, and enforce claims over extraction and exchange. The operation of these powers requires historically specific evidence. This thesis therefore asks how salt connected selected commodities, communities, places, and authorities within a specified Western Himalayan source corpus, and how those connections differed across sources and settings. It brings source-attributed relationships into a common representation and interprets them through close reading. Salt’s role as a connective backbone remains a hypothesis: frequent mentions, shared routes, or graph centrality do not independently establish economic dependence or region-wide dominance. Historical distinctions between periods, jurisdictions, and kinds of relationship must remain visible in the analysis. The following chapter examines the documentary materials through which these relationships can be reconstructed, including the limits imposed by administrative classification, selective observation, and uneven survival of evidence.</w:t>
       </w:r>
     </w:p>
     <w:p>
@@ -691,38 +691,6 @@
       <w:r>
         <w:rPr/>
         <w:t>.</w:t>
-      </w:r>
-    </w:p>
-    <w:p>
-      <w:pPr>
-        <w:pStyle w:val="BodyText"/>
-        <w:bidi w:val="0"/>
-        <w:jc w:val="start"/>
-        <w:rPr/>
-      </w:pPr>
-      <w:r>
-        <w:rPr/>
-        <w:t xml:space="preserve">Bharti, S. (n.d.) </w:t>
-      </w:r>
-      <w:r>
-        <w:rPr>
-          <w:rStyle w:val="Emphasis"/>
-        </w:rPr>
-        <w:t>Circuits of Salt: Commodity Networks and the Politics of Trade in 20th Century Himalayas</w:t>
-      </w:r>
-      <w:r>
-        <w:rPr/>
-        <w:t xml:space="preserve">. Unpublished project manuscript, International Institute of Information Technology, Hyderabad. Local file: </w:t>
-      </w:r>
-      <w:r>
-        <w:rPr>
-          <w:rStyle w:val="SourceText"/>
-        </w:rPr>
-        <w:t>References/Samagra_Bharti_2022115007.pdf</w:t>
-      </w:r>
-      <w:r>
-        <w:rPr/>
-        <w:t>, 5 pages. Cited for the project’s earlier conceptual proposition; its anticipated computational results are not treated as findings.</w:t>
       </w:r>
     </w:p>
     <w:p>
@@ -1821,13 +1789,6 @@
       <ns0:u ns0:val="single"/>
     </ns0:rPr>
   </ns0:style>
-  <ns0:style ns0:type="character" ns0:styleId="SourceText">
-    <ns0:name ns0:val="Source Text"/>
-    <ns0:qFormat/>
-    <ns0:rPr>
-      <ns0:rFonts ns0:ascii="Liberation Mono" ns0:hAnsi="Liberation Mono" ns0:eastAsia="Noto Sans Mono CJK SC" ns0:cs="Liberation Mono"/>
-    </ns0:rPr>
-  </ns0:style>
   <ns0:style ns0:type="character" ns0:styleId="Strong">
     <ns0:name ns0:val="Strong"/>
     <ns0:qFormat/>
@@ -1841,6 +1802,13 @@
     <ns0:qFormat/>
     <ns0:rPr>
       <ns0:rFonts ns0:ascii="OpenSymbol" ns0:hAnsi="OpenSymbol" ns0:eastAsia="OpenSymbol" ns0:cs="OpenSymbol"/>
+    </ns0:rPr>
+  </ns0:style>
+  <ns0:style ns0:type="character" ns0:styleId="SourceText">
+    <ns0:name ns0:val="Source Text"/>
+    <ns0:qFormat/>
+    <ns0:rPr>
+      <ns0:rFonts ns0:ascii="Liberation Mono" ns0:hAnsi="Liberation Mono" ns0:eastAsia="Noto Sans Mono CJK SC" ns0:cs="Liberation Mono"/>
     </ns0:rPr>
   </ns0:style>
   <ns0:style ns0:type="paragraph" ns0:styleId="HorizontalLine">

</xml_diff>